<commit_message>
feat(evaluation): Stage P1.2 - 28-item versioned golden benchmark suite, multi-mode CLI & RBAC
</commit_message>
<xml_diff>
--- a/backend/tests/fixtures/documents/Industrial_Boiler_Commissioning_Guide.docx
+++ b/backend/tests/fixtures/documents/Industrial_Boiler_Commissioning_Guide.docx
@@ -7,12 +7,12 @@
         <w:pStyle w:val="Heading1"/>
       </w:pPr>
       <w:r>
-        <w:t>SELNIKEL COMMISSIONING &amp; TOLERANCE GUIDE</w:t>
+        <w:t>SELNIKEL INDUSTRIAL BOILER COMMISSIONING GUIDE</w:t>
       </w:r>
     </w:p>
     <w:p>
       <w:r>
-        <w:t>Document: CG-2026-V1 | Department: Field Service</w:t>
+        <w:t>Site Installation, Electrical Verification &amp; Regulatory Standards | Revision: REV-01</w:t>
       </w:r>
     </w:p>
     <w:p>
@@ -21,11 +21,6 @@
       </w:pPr>
       <w:r>
         <w:t>1. Pre-Commissioning Electrical Limits</w:t>
-      </w:r>
-    </w:p>
-    <w:p>
-      <w:r>
-        <w:t>Verify 3-phase supply voltage: 400 V +/- 10% at 50 Hz.</w:t>
       </w:r>
     </w:p>
     <w:tbl>
@@ -110,38 +105,6 @@
           </w:tcPr>
           <w:p>
             <w:r>
-              <w:t>T1-T2</w:t>
-            </w:r>
-          </w:p>
-        </w:tc>
-        <w:tc>
-          <w:tcPr>
-            <w:tcW w:type="dxa" w:w="2880"/>
-          </w:tcPr>
-          <w:p>
-            <w:r>
-              <w:t>PT100 Sensor</w:t>
-            </w:r>
-          </w:p>
-        </w:tc>
-        <w:tc>
-          <w:tcPr>
-            <w:tcW w:type="dxa" w:w="2880"/>
-          </w:tcPr>
-          <w:p>
-            <w:r>
-              <w:t>0 - 300 °C</w:t>
-            </w:r>
-          </w:p>
-        </w:tc>
-      </w:tr>
-      <w:tr>
-        <w:tc>
-          <w:tcPr>
-            <w:tcW w:type="dxa" w:w="2880"/>
-          </w:tcPr>
-          <w:p>
-            <w:r>
               <w:t>P1-P2</w:t>
             </w:r>
           </w:p>
@@ -169,6 +132,34 @@
       </w:tr>
     </w:tbl>
     <w:p>
+      <w:pPr>
+        <w:pStyle w:val="Heading2"/>
+      </w:pPr>
+      <w:r>
+        <w:t>2. Standards, Directives &amp; Regulatory Compliance</w:t>
+      </w:r>
+    </w:p>
+    <w:p>
+      <w:r>
+        <w:t>All Selnikel industrial steam boilers and burner installations strictly comply with mandatory European harmonized standards:</w:t>
+      </w:r>
+    </w:p>
+    <w:p>
+      <w:r>
+        <w:t>Shell Boilers Manufacturing Standard: EN 12953 for shell boilers design, safety and manufacturing requirements.</w:t>
+      </w:r>
+    </w:p>
+    <w:p>
+      <w:r>
+        <w:t>Pressure Equipment Directive: PED 2014/68/EU Category IV conformity module H1 certification.</w:t>
+      </w:r>
+    </w:p>
+    <w:p>
+      <w:r>
+        <w:t>Forced Draught Gas Burner Standard: EN 676 automatic forced draught burners for gaseous fuels.</w:t>
+      </w:r>
+    </w:p>
+    <w:p>
       <w:r>
         <w:br w:type="page"/>
       </w:r>
@@ -178,12 +169,7 @@
         <w:pStyle w:val="Heading2"/>
       </w:pPr>
       <w:r>
-        <w:t>2. Flue Gas Emission Limits</w:t>
-      </w:r>
-    </w:p>
-    <w:p>
-      <w:r>
-        <w:t>Measured at nominal capacity under dry flue gas conditions:</w:t>
+        <w:t>3. Flue Gas Emission Limits</w:t>
       </w:r>
     </w:p>
     <w:tbl>
@@ -289,38 +275,6 @@
           <w:p>
             <w:r>
               <w:t>&lt; 150 mg/kWh</w:t>
-            </w:r>
-          </w:p>
-        </w:tc>
-      </w:tr>
-      <w:tr>
-        <w:tc>
-          <w:tcPr>
-            <w:tcW w:type="dxa" w:w="2880"/>
-          </w:tcPr>
-          <w:p>
-            <w:r>
-              <w:t>Flue Temp (Net)</w:t>
-            </w:r>
-          </w:p>
-        </w:tc>
-        <w:tc>
-          <w:tcPr>
-            <w:tcW w:type="dxa" w:w="2880"/>
-          </w:tcPr>
-          <w:p>
-            <w:r>
-              <w:t>160 - 180 °C</w:t>
-            </w:r>
-          </w:p>
-        </w:tc>
-        <w:tc>
-          <w:tcPr>
-            <w:tcW w:type="dxa" w:w="2880"/>
-          </w:tcPr>
-          <w:p>
-            <w:r>
-              <w:t>180 - 210 °C</w:t>
             </w:r>
           </w:p>
         </w:tc>

</xml_diff>